<commit_message>
render kable tables properly in word documents
</commit_message>
<xml_diff>
--- a/manuscript-workingPaper/manuscript-workingPaper.docx
+++ b/manuscript-workingPaper/manuscript-workingPaper.docx
@@ -1339,108 +1339,180 @@
     </w:p>
     <w:p>
       <w:pPr>
-        <w:pStyle w:val="Compact"/>
+        <w:pStyle w:val="TableCaption"/>
       </w:pPr>
       <w:r>
         <w:t xml:space="preserve">Table 1: A knitr kable table</w:t>
       </w:r>
     </w:p>
-    <w:p>
-      <w:pPr>
-        <w:pStyle w:val="Compact"/>
-      </w:pPr>
-      <w:r>
-        <w:t xml:space="preserve">speed</w:t>
-      </w:r>
-    </w:p>
-    <w:p>
-      <w:pPr>
-        <w:pStyle w:val="Compact"/>
-      </w:pPr>
-      <w:r>
-        <w:t xml:space="preserve">dist</w:t>
-      </w:r>
-    </w:p>
-    <w:p>
-      <w:pPr>
-        <w:pStyle w:val="Compact"/>
-      </w:pPr>
-      <w:r>
-        <w:t xml:space="preserve">4</w:t>
-      </w:r>
-    </w:p>
-    <w:p>
-      <w:pPr>
-        <w:pStyle w:val="Compact"/>
-      </w:pPr>
-      <w:r>
-        <w:t xml:space="preserve">2</w:t>
-      </w:r>
-    </w:p>
-    <w:p>
-      <w:pPr>
-        <w:pStyle w:val="Compact"/>
-      </w:pPr>
-      <w:r>
-        <w:t xml:space="preserve">4</w:t>
-      </w:r>
-    </w:p>
-    <w:p>
-      <w:pPr>
-        <w:pStyle w:val="Compact"/>
-      </w:pPr>
-      <w:r>
-        <w:t xml:space="preserve">10</w:t>
-      </w:r>
-    </w:p>
-    <w:p>
-      <w:pPr>
-        <w:pStyle w:val="Compact"/>
-      </w:pPr>
-      <w:r>
-        <w:t xml:space="preserve">7</w:t>
-      </w:r>
-    </w:p>
-    <w:p>
-      <w:pPr>
-        <w:pStyle w:val="Compact"/>
-      </w:pPr>
-      <w:r>
-        <w:t xml:space="preserve">4</w:t>
-      </w:r>
-    </w:p>
-    <w:p>
-      <w:pPr>
-        <w:pStyle w:val="Compact"/>
-      </w:pPr>
-      <w:r>
-        <w:t xml:space="preserve">7</w:t>
-      </w:r>
-    </w:p>
-    <w:p>
-      <w:pPr>
-        <w:pStyle w:val="Compact"/>
-      </w:pPr>
-      <w:r>
-        <w:t xml:space="preserve">22</w:t>
-      </w:r>
-    </w:p>
-    <w:p>
-      <w:pPr>
-        <w:pStyle w:val="Compact"/>
-      </w:pPr>
-      <w:r>
-        <w:t xml:space="preserve">8</w:t>
-      </w:r>
-    </w:p>
-    <w:p>
-      <w:pPr>
-        <w:pStyle w:val="Compact"/>
-      </w:pPr>
-      <w:r>
-        <w:t xml:space="preserve">16</w:t>
-      </w:r>
-    </w:p>
+    <w:tbl>
+      <w:tblPr>
+        <w:tblStyle w:val="Table"/>
+        <w:tblW w:type="pct" w:w="0.0"/>
+        <w:tblLook w:firstRow="1"/>
+        <w:tblCaption w:val="Table 1: A knitr kable table"/>
+      </w:tblPr>
+      <w:tblGrid/>
+      <w:tr>
+        <w:trPr>
+          <w:cnfStyle w:firstRow="1"/>
+        </w:trPr>
+        <w:tc>
+          <w:tcPr>
+            <w:tcBorders>
+              <w:bottom w:val="single"/>
+            </w:tcBorders>
+            <w:vAlign w:val="bottom"/>
+          </w:tcPr>
+          <w:p>
+            <w:pPr>
+              <w:pStyle w:val="Compact"/>
+              <w:jc w:val="right"/>
+            </w:pPr>
+            <w:r>
+              <w:t xml:space="preserve">speed</w:t>
+            </w:r>
+          </w:p>
+        </w:tc>
+        <w:tc>
+          <w:tcPr>
+            <w:tcBorders>
+              <w:bottom w:val="single"/>
+            </w:tcBorders>
+            <w:vAlign w:val="bottom"/>
+          </w:tcPr>
+          <w:p>
+            <w:pPr>
+              <w:pStyle w:val="Compact"/>
+              <w:jc w:val="right"/>
+            </w:pPr>
+            <w:r>
+              <w:t xml:space="preserve">dist</w:t>
+            </w:r>
+          </w:p>
+        </w:tc>
+      </w:tr>
+      <w:tr>
+        <w:tc>
+          <w:p>
+            <w:pPr>
+              <w:pStyle w:val="Compact"/>
+              <w:jc w:val="right"/>
+            </w:pPr>
+            <w:r>
+              <w:t xml:space="preserve">4</w:t>
+            </w:r>
+          </w:p>
+        </w:tc>
+        <w:tc>
+          <w:p>
+            <w:pPr>
+              <w:pStyle w:val="Compact"/>
+              <w:jc w:val="right"/>
+            </w:pPr>
+            <w:r>
+              <w:t xml:space="preserve">2</w:t>
+            </w:r>
+          </w:p>
+        </w:tc>
+      </w:tr>
+      <w:tr>
+        <w:tc>
+          <w:p>
+            <w:pPr>
+              <w:pStyle w:val="Compact"/>
+              <w:jc w:val="right"/>
+            </w:pPr>
+            <w:r>
+              <w:t xml:space="preserve">4</w:t>
+            </w:r>
+          </w:p>
+        </w:tc>
+        <w:tc>
+          <w:p>
+            <w:pPr>
+              <w:pStyle w:val="Compact"/>
+              <w:jc w:val="right"/>
+            </w:pPr>
+            <w:r>
+              <w:t xml:space="preserve">10</w:t>
+            </w:r>
+          </w:p>
+        </w:tc>
+      </w:tr>
+      <w:tr>
+        <w:tc>
+          <w:p>
+            <w:pPr>
+              <w:pStyle w:val="Compact"/>
+              <w:jc w:val="right"/>
+            </w:pPr>
+            <w:r>
+              <w:t xml:space="preserve">7</w:t>
+            </w:r>
+          </w:p>
+        </w:tc>
+        <w:tc>
+          <w:p>
+            <w:pPr>
+              <w:pStyle w:val="Compact"/>
+              <w:jc w:val="right"/>
+            </w:pPr>
+            <w:r>
+              <w:t xml:space="preserve">4</w:t>
+            </w:r>
+          </w:p>
+        </w:tc>
+      </w:tr>
+      <w:tr>
+        <w:tc>
+          <w:p>
+            <w:pPr>
+              <w:pStyle w:val="Compact"/>
+              <w:jc w:val="right"/>
+            </w:pPr>
+            <w:r>
+              <w:t xml:space="preserve">7</w:t>
+            </w:r>
+          </w:p>
+        </w:tc>
+        <w:tc>
+          <w:p>
+            <w:pPr>
+              <w:pStyle w:val="Compact"/>
+              <w:jc w:val="right"/>
+            </w:pPr>
+            <w:r>
+              <w:t xml:space="preserve">22</w:t>
+            </w:r>
+          </w:p>
+        </w:tc>
+      </w:tr>
+      <w:tr>
+        <w:tc>
+          <w:p>
+            <w:pPr>
+              <w:pStyle w:val="Compact"/>
+              <w:jc w:val="right"/>
+            </w:pPr>
+            <w:r>
+              <w:t xml:space="preserve">8</w:t>
+            </w:r>
+          </w:p>
+        </w:tc>
+        <w:tc>
+          <w:p>
+            <w:pPr>
+              <w:pStyle w:val="Compact"/>
+              <w:jc w:val="right"/>
+            </w:pPr>
+            <w:r>
+              <w:t xml:space="preserve">16</w:t>
+            </w:r>
+          </w:p>
+        </w:tc>
+      </w:tr>
+    </w:tbl>
     <w:p>
       <w:pPr>
         <w:pStyle w:val="BodyText"/>
@@ -1451,636 +1523,944 @@
     </w:p>
     <w:p>
       <w:pPr>
-        <w:pStyle w:val="Compact"/>
+        <w:pStyle w:val="TableCaption"/>
       </w:pPr>
       <w:r>
         <w:t xml:space="preserve">Table 2: An imported table</w:t>
       </w:r>
     </w:p>
-    <w:p>
-      <w:pPr>
-        <w:pStyle w:val="Compact"/>
-      </w:pPr>
-      <w:r>
-        <w:t xml:space="preserve">X1</w:t>
-      </w:r>
-    </w:p>
-    <w:p>
-      <w:pPr>
-        <w:pStyle w:val="Compact"/>
-      </w:pPr>
-      <w:r>
-        <w:t xml:space="preserve">Mean</w:t>
-      </w:r>
-    </w:p>
-    <w:p>
-      <w:pPr>
-        <w:pStyle w:val="Compact"/>
-      </w:pPr>
-      <w:r>
-        <w:t xml:space="preserve">Std. Dev.</w:t>
-      </w:r>
-    </w:p>
-    <w:p>
-      <w:pPr>
-        <w:pStyle w:val="Compact"/>
-      </w:pPr>
-      <w:r>
-        <w:t xml:space="preserve">Min</w:t>
-      </w:r>
-    </w:p>
-    <w:p>
-      <w:pPr>
-        <w:pStyle w:val="Compact"/>
-      </w:pPr>
-      <w:r>
-        <w:t xml:space="preserve">Median</w:t>
-      </w:r>
-    </w:p>
-    <w:p>
-      <w:pPr>
-        <w:pStyle w:val="Compact"/>
-      </w:pPr>
-      <w:r>
-        <w:t xml:space="preserve">Max</w:t>
-      </w:r>
-    </w:p>
-    <w:p>
-      <w:pPr>
-        <w:pStyle w:val="Compact"/>
-      </w:pPr>
-      <w:r>
-        <w:t xml:space="preserve">Scale 1: Original values</w:t>
-      </w:r>
-    </w:p>
-    <w:p>
-      <w:pPr>
-        <w:pStyle w:val="Compact"/>
-      </w:pPr>
-      <w:r>
-        <w:t xml:space="preserve">NA</w:t>
-      </w:r>
-    </w:p>
-    <w:p>
-      <w:pPr>
-        <w:pStyle w:val="Compact"/>
-      </w:pPr>
-      <w:r>
-        <w:t xml:space="preserve">NA</w:t>
-      </w:r>
-    </w:p>
-    <w:p>
-      <w:pPr>
-        <w:pStyle w:val="Compact"/>
-      </w:pPr>
-      <w:r>
-        <w:t xml:space="preserve">NA</w:t>
-      </w:r>
-    </w:p>
-    <w:p>
-      <w:pPr>
-        <w:pStyle w:val="Compact"/>
-      </w:pPr>
-      <w:r>
-        <w:t xml:space="preserve">NA</w:t>
-      </w:r>
-    </w:p>
-    <w:p>
-      <w:pPr>
-        <w:pStyle w:val="Compact"/>
-      </w:pPr>
-      <w:r>
-        <w:t xml:space="preserve">NA</w:t>
-      </w:r>
-    </w:p>
-    <w:p>
-      <w:pPr>
-        <w:pStyle w:val="Compact"/>
-      </w:pPr>
-      <w:r>
-        <w:t xml:space="preserve">Labor productivity</w:t>
-      </w:r>
-    </w:p>
-    <w:p>
-      <w:pPr>
-        <w:pStyle w:val="Compact"/>
-      </w:pPr>
-      <w:r>
-        <w:t xml:space="preserve">19.09</w:t>
-      </w:r>
-    </w:p>
-    <w:p>
-      <w:pPr>
-        <w:pStyle w:val="Compact"/>
-      </w:pPr>
-      <w:r>
-        <w:t xml:space="preserve">16.82</w:t>
-      </w:r>
-    </w:p>
-    <w:p>
-      <w:pPr>
-        <w:pStyle w:val="Compact"/>
-      </w:pPr>
-      <w:r>
-        <w:t xml:space="preserve">5.89</w:t>
-      </w:r>
-    </w:p>
-    <w:p>
-      <w:pPr>
-        <w:pStyle w:val="Compact"/>
-      </w:pPr>
-      <w:r>
-        <w:t xml:space="preserve">14.35</w:t>
-      </w:r>
-    </w:p>
-    <w:p>
-      <w:pPr>
-        <w:pStyle w:val="Compact"/>
-      </w:pPr>
-      <w:r>
-        <w:t xml:space="preserve">75.03</w:t>
-      </w:r>
-    </w:p>
-    <w:p>
-      <w:pPr>
-        <w:pStyle w:val="Compact"/>
-      </w:pPr>
-      <w:r>
-        <w:t xml:space="preserve">Physical capital</w:t>
-      </w:r>
-    </w:p>
-    <w:p>
-      <w:pPr>
-        <w:pStyle w:val="Compact"/>
-      </w:pPr>
-      <w:r>
-        <w:t xml:space="preserve">42.39</w:t>
-      </w:r>
-    </w:p>
-    <w:p>
-      <w:pPr>
-        <w:pStyle w:val="Compact"/>
-      </w:pPr>
-      <w:r>
-        <w:t xml:space="preserve">48.67</w:t>
-      </w:r>
-    </w:p>
-    <w:p>
-      <w:pPr>
-        <w:pStyle w:val="Compact"/>
-      </w:pPr>
-      <w:r>
-        <w:t xml:space="preserve">11.13</w:t>
-      </w:r>
-    </w:p>
-    <w:p>
-      <w:pPr>
-        <w:pStyle w:val="Compact"/>
-      </w:pPr>
-      <w:r>
-        <w:t xml:space="preserve">27.27</w:t>
-      </w:r>
-    </w:p>
-    <w:p>
-      <w:pPr>
-        <w:pStyle w:val="Compact"/>
-      </w:pPr>
-      <w:r>
-        <w:t xml:space="preserve">248.79</w:t>
-      </w:r>
-    </w:p>
-    <w:p>
-      <w:pPr>
-        <w:pStyle w:val="Compact"/>
-      </w:pPr>
-      <w:r>
-        <w:t xml:space="preserve">Human capital</w:t>
-      </w:r>
-    </w:p>
-    <w:p>
-      <w:pPr>
-        <w:pStyle w:val="Compact"/>
-      </w:pPr>
-      <w:r>
-        <w:t xml:space="preserve">7.91</w:t>
-      </w:r>
-    </w:p>
-    <w:p>
-      <w:pPr>
-        <w:pStyle w:val="Compact"/>
-      </w:pPr>
-      <w:r>
-        <w:t xml:space="preserve">0.99</w:t>
-      </w:r>
-    </w:p>
-    <w:p>
-      <w:pPr>
-        <w:pStyle w:val="Compact"/>
-      </w:pPr>
-      <w:r>
-        <w:t xml:space="preserve">5.27</w:t>
-      </w:r>
-    </w:p>
-    <w:p>
-      <w:pPr>
-        <w:pStyle w:val="Compact"/>
-      </w:pPr>
-      <w:r>
-        <w:t xml:space="preserve">7.95</w:t>
-      </w:r>
-    </w:p>
-    <w:p>
-      <w:pPr>
-        <w:pStyle w:val="Compact"/>
-      </w:pPr>
-      <w:r>
-        <w:t xml:space="preserve">10.42</w:t>
-      </w:r>
-    </w:p>
-    <w:p>
-      <w:pPr>
-        <w:pStyle w:val="Compact"/>
-      </w:pPr>
-      <w:r>
-        <w:t xml:space="preserve">Efficiency (parametric)</w:t>
-      </w:r>
-    </w:p>
-    <w:p>
-      <w:pPr>
-        <w:pStyle w:val="Compact"/>
-      </w:pPr>
-      <w:r>
-        <w:t xml:space="preserve">1.33</w:t>
-      </w:r>
-    </w:p>
-    <w:p>
-      <w:pPr>
-        <w:pStyle w:val="Compact"/>
-      </w:pPr>
-      <w:r>
-        <w:t xml:space="preserve">0.57</w:t>
-      </w:r>
-    </w:p>
-    <w:p>
-      <w:pPr>
-        <w:pStyle w:val="Compact"/>
-      </w:pPr>
-      <w:r>
-        <w:t xml:space="preserve">0.73</w:t>
-      </w:r>
-    </w:p>
-    <w:p>
-      <w:pPr>
-        <w:pStyle w:val="Compact"/>
-      </w:pPr>
-      <w:r>
-        <w:t xml:space="preserve">1.21</w:t>
-      </w:r>
-    </w:p>
-    <w:p>
-      <w:pPr>
-        <w:pStyle w:val="Compact"/>
-      </w:pPr>
-      <w:r>
-        <w:t xml:space="preserve">3.35</w:t>
-      </w:r>
-    </w:p>
-    <w:p>
-      <w:pPr>
-        <w:pStyle w:val="Compact"/>
-      </w:pPr>
-      <w:r>
-        <w:t xml:space="preserve">Efficiency (nonparametric)</w:t>
-      </w:r>
-    </w:p>
-    <w:p>
-      <w:pPr>
-        <w:pStyle w:val="Compact"/>
-      </w:pPr>
-      <w:r>
-        <w:t xml:space="preserve">77.13</w:t>
-      </w:r>
-    </w:p>
-    <w:p>
-      <w:pPr>
-        <w:pStyle w:val="Compact"/>
-      </w:pPr>
-      <w:r>
-        <w:t xml:space="preserve">17.76</w:t>
-      </w:r>
-    </w:p>
-    <w:p>
-      <w:pPr>
-        <w:pStyle w:val="Compact"/>
-      </w:pPr>
-      <w:r>
-        <w:t xml:space="preserve">40.70</w:t>
-      </w:r>
-    </w:p>
-    <w:p>
-      <w:pPr>
-        <w:pStyle w:val="Compact"/>
-      </w:pPr>
-      <w:r>
-        <w:t xml:space="preserve">77.55</w:t>
-      </w:r>
-    </w:p>
-    <w:p>
-      <w:pPr>
-        <w:pStyle w:val="Compact"/>
-      </w:pPr>
-      <w:r>
-        <w:t xml:space="preserve">100.00</w:t>
-      </w:r>
-    </w:p>
-    <w:p>
-      <w:pPr>
-        <w:pStyle w:val="Compact"/>
-      </w:pPr>
-      <w:r>
-        <w:t xml:space="preserve">Scale 2: Relative log trends</w:t>
-      </w:r>
-    </w:p>
-    <w:p>
-      <w:pPr>
-        <w:pStyle w:val="Compact"/>
-      </w:pPr>
-      <w:r>
-        <w:t xml:space="preserve">NA</w:t>
-      </w:r>
-    </w:p>
-    <w:p>
-      <w:pPr>
-        <w:pStyle w:val="Compact"/>
-      </w:pPr>
-      <w:r>
-        <w:t xml:space="preserve">NA</w:t>
-      </w:r>
-    </w:p>
-    <w:p>
-      <w:pPr>
-        <w:pStyle w:val="Compact"/>
-      </w:pPr>
-      <w:r>
-        <w:t xml:space="preserve">NA</w:t>
-      </w:r>
-    </w:p>
-    <w:p>
-      <w:pPr>
-        <w:pStyle w:val="Compact"/>
-      </w:pPr>
-      <w:r>
-        <w:t xml:space="preserve">NA</w:t>
-      </w:r>
-    </w:p>
-    <w:p>
-      <w:pPr>
-        <w:pStyle w:val="Compact"/>
-      </w:pPr>
-      <w:r>
-        <w:t xml:space="preserve">NA</w:t>
-      </w:r>
-    </w:p>
-    <w:p>
-      <w:pPr>
-        <w:pStyle w:val="Compact"/>
-      </w:pPr>
-      <w:r>
-        <w:t xml:space="preserve">Labor productivity</w:t>
-      </w:r>
-    </w:p>
-    <w:p>
-      <w:pPr>
-        <w:pStyle w:val="Compact"/>
-      </w:pPr>
-      <w:r>
-        <w:t xml:space="preserve">1.00</w:t>
-      </w:r>
-    </w:p>
-    <w:p>
-      <w:pPr>
-        <w:pStyle w:val="Compact"/>
-      </w:pPr>
-      <w:r>
-        <w:t xml:space="preserve">0.22</w:t>
-      </w:r>
-    </w:p>
-    <w:p>
-      <w:pPr>
-        <w:pStyle w:val="Compact"/>
-      </w:pPr>
-      <w:r>
-        <w:t xml:space="preserve">0.64</w:t>
-      </w:r>
-    </w:p>
-    <w:p>
-      <w:pPr>
-        <w:pStyle w:val="Compact"/>
-      </w:pPr>
-      <w:r>
-        <w:t xml:space="preserve">0.96</w:t>
-      </w:r>
-    </w:p>
-    <w:p>
-      <w:pPr>
-        <w:pStyle w:val="Compact"/>
-      </w:pPr>
-      <w:r>
-        <w:t xml:space="preserve">1.59</w:t>
-      </w:r>
-    </w:p>
-    <w:p>
-      <w:pPr>
-        <w:pStyle w:val="Compact"/>
-      </w:pPr>
-      <w:r>
-        <w:t xml:space="preserve">Physical capital</w:t>
-      </w:r>
-    </w:p>
-    <w:p>
-      <w:pPr>
-        <w:pStyle w:val="Compact"/>
-      </w:pPr>
-      <w:r>
-        <w:t xml:space="preserve">1.00</w:t>
-      </w:r>
-    </w:p>
-    <w:p>
-      <w:pPr>
-        <w:pStyle w:val="Compact"/>
-      </w:pPr>
-      <w:r>
-        <w:t xml:space="preserve">0.21</w:t>
-      </w:r>
-    </w:p>
-    <w:p>
-      <w:pPr>
-        <w:pStyle w:val="Compact"/>
-      </w:pPr>
-      <w:r>
-        <w:t xml:space="preserve">0.70</w:t>
-      </w:r>
-    </w:p>
-    <w:p>
-      <w:pPr>
-        <w:pStyle w:val="Compact"/>
-      </w:pPr>
-      <w:r>
-        <w:t xml:space="preserve">0.96</w:t>
-      </w:r>
-    </w:p>
-    <w:p>
-      <w:pPr>
-        <w:pStyle w:val="Compact"/>
-      </w:pPr>
-      <w:r>
-        <w:t xml:space="preserve">1.61</w:t>
-      </w:r>
-    </w:p>
-    <w:p>
-      <w:pPr>
-        <w:pStyle w:val="Compact"/>
-      </w:pPr>
-      <w:r>
-        <w:t xml:space="preserve">Human capital</w:t>
-      </w:r>
-    </w:p>
-    <w:p>
-      <w:pPr>
-        <w:pStyle w:val="Compact"/>
-      </w:pPr>
-      <w:r>
-        <w:t xml:space="preserve">1.00</w:t>
-      </w:r>
-    </w:p>
-    <w:p>
-      <w:pPr>
-        <w:pStyle w:val="Compact"/>
-      </w:pPr>
-      <w:r>
-        <w:t xml:space="preserve">0.06</w:t>
-      </w:r>
-    </w:p>
-    <w:p>
-      <w:pPr>
-        <w:pStyle w:val="Compact"/>
-      </w:pPr>
-      <w:r>
-        <w:t xml:space="preserve">0.82</w:t>
-      </w:r>
-    </w:p>
-    <w:p>
-      <w:pPr>
-        <w:pStyle w:val="Compact"/>
-      </w:pPr>
-      <w:r>
-        <w:t xml:space="preserve">1.01</w:t>
-      </w:r>
-    </w:p>
-    <w:p>
-      <w:pPr>
-        <w:pStyle w:val="Compact"/>
-      </w:pPr>
-      <w:r>
-        <w:t xml:space="preserve">1.14</w:t>
-      </w:r>
-    </w:p>
-    <w:p>
-      <w:pPr>
-        <w:pStyle w:val="Compact"/>
-      </w:pPr>
-      <w:r>
-        <w:t xml:space="preserve">Efficiency (parametric)</w:t>
-      </w:r>
-    </w:p>
-    <w:p>
-      <w:pPr>
-        <w:pStyle w:val="Compact"/>
-      </w:pPr>
-      <w:r>
-        <w:t xml:space="preserve">1.00</w:t>
-      </w:r>
-    </w:p>
-    <w:p>
-      <w:pPr>
-        <w:pStyle w:val="Compact"/>
-      </w:pPr>
-      <w:r>
-        <w:t xml:space="preserve">1.52</w:t>
-      </w:r>
-    </w:p>
-    <w:p>
-      <w:pPr>
-        <w:pStyle w:val="Compact"/>
-      </w:pPr>
-      <w:r>
-        <w:t xml:space="preserve">-1.33</w:t>
-      </w:r>
-    </w:p>
-    <w:p>
-      <w:pPr>
-        <w:pStyle w:val="Compact"/>
-      </w:pPr>
-      <w:r>
-        <w:t xml:space="preserve">0.82</w:t>
-      </w:r>
-    </w:p>
-    <w:p>
-      <w:pPr>
-        <w:pStyle w:val="Compact"/>
-      </w:pPr>
-      <w:r>
-        <w:t xml:space="preserve">5.38</w:t>
-      </w:r>
-    </w:p>
-    <w:p>
-      <w:pPr>
-        <w:pStyle w:val="Compact"/>
-      </w:pPr>
-      <w:r>
-        <w:t xml:space="preserve">Efficiency (nonparametric)</w:t>
-      </w:r>
-    </w:p>
-    <w:p>
-      <w:pPr>
-        <w:pStyle w:val="Compact"/>
-      </w:pPr>
-      <w:r>
-        <w:t xml:space="preserve">1.00</w:t>
-      </w:r>
-    </w:p>
-    <w:p>
-      <w:pPr>
-        <w:pStyle w:val="Compact"/>
-      </w:pPr>
-      <w:r>
-        <w:t xml:space="preserve">0.06</w:t>
-      </w:r>
-    </w:p>
-    <w:p>
-      <w:pPr>
-        <w:pStyle w:val="Compact"/>
-      </w:pPr>
-      <w:r>
-        <w:t xml:space="preserve">0.86</w:t>
-      </w:r>
-    </w:p>
-    <w:p>
-      <w:pPr>
-        <w:pStyle w:val="Compact"/>
-      </w:pPr>
-      <w:r>
-        <w:t xml:space="preserve">1.01</w:t>
-      </w:r>
-    </w:p>
-    <w:p>
-      <w:pPr>
-        <w:pStyle w:val="Compact"/>
-      </w:pPr>
-      <w:r>
-        <w:t xml:space="preserve">1.07</w:t>
-      </w:r>
-    </w:p>
+    <w:tbl>
+      <w:tblPr>
+        <w:tblStyle w:val="Table"/>
+        <w:tblW w:type="pct" w:w="0.0"/>
+        <w:tblLook w:firstRow="1"/>
+        <w:tblCaption w:val="Table 2: An imported table"/>
+      </w:tblPr>
+      <w:tblGrid/>
+      <w:tr>
+        <w:trPr>
+          <w:cnfStyle w:firstRow="1"/>
+        </w:trPr>
+        <w:tc>
+          <w:tcPr>
+            <w:tcBorders>
+              <w:bottom w:val="single"/>
+            </w:tcBorders>
+            <w:vAlign w:val="bottom"/>
+          </w:tcPr>
+          <w:p>
+            <w:pPr>
+              <w:pStyle w:val="Compact"/>
+              <w:jc w:val="left"/>
+            </w:pPr>
+            <w:r>
+              <w:t xml:space="preserve">X1</w:t>
+            </w:r>
+          </w:p>
+        </w:tc>
+        <w:tc>
+          <w:tcPr>
+            <w:tcBorders>
+              <w:bottom w:val="single"/>
+            </w:tcBorders>
+            <w:vAlign w:val="bottom"/>
+          </w:tcPr>
+          <w:p>
+            <w:pPr>
+              <w:pStyle w:val="Compact"/>
+              <w:jc w:val="right"/>
+            </w:pPr>
+            <w:r>
+              <w:t xml:space="preserve">Mean</w:t>
+            </w:r>
+          </w:p>
+        </w:tc>
+        <w:tc>
+          <w:tcPr>
+            <w:tcBorders>
+              <w:bottom w:val="single"/>
+            </w:tcBorders>
+            <w:vAlign w:val="bottom"/>
+          </w:tcPr>
+          <w:p>
+            <w:pPr>
+              <w:pStyle w:val="Compact"/>
+              <w:jc w:val="right"/>
+            </w:pPr>
+            <w:r>
+              <w:t xml:space="preserve">Std. Dev.</w:t>
+            </w:r>
+          </w:p>
+        </w:tc>
+        <w:tc>
+          <w:tcPr>
+            <w:tcBorders>
+              <w:bottom w:val="single"/>
+            </w:tcBorders>
+            <w:vAlign w:val="bottom"/>
+          </w:tcPr>
+          <w:p>
+            <w:pPr>
+              <w:pStyle w:val="Compact"/>
+              <w:jc w:val="right"/>
+            </w:pPr>
+            <w:r>
+              <w:t xml:space="preserve">Min</w:t>
+            </w:r>
+          </w:p>
+        </w:tc>
+        <w:tc>
+          <w:tcPr>
+            <w:tcBorders>
+              <w:bottom w:val="single"/>
+            </w:tcBorders>
+            <w:vAlign w:val="bottom"/>
+          </w:tcPr>
+          <w:p>
+            <w:pPr>
+              <w:pStyle w:val="Compact"/>
+              <w:jc w:val="right"/>
+            </w:pPr>
+            <w:r>
+              <w:t xml:space="preserve">Median</w:t>
+            </w:r>
+          </w:p>
+        </w:tc>
+        <w:tc>
+          <w:tcPr>
+            <w:tcBorders>
+              <w:bottom w:val="single"/>
+            </w:tcBorders>
+            <w:vAlign w:val="bottom"/>
+          </w:tcPr>
+          <w:p>
+            <w:pPr>
+              <w:pStyle w:val="Compact"/>
+              <w:jc w:val="right"/>
+            </w:pPr>
+            <w:r>
+              <w:t xml:space="preserve">Max</w:t>
+            </w:r>
+          </w:p>
+        </w:tc>
+      </w:tr>
+      <w:tr>
+        <w:tc>
+          <w:p>
+            <w:pPr>
+              <w:pStyle w:val="Compact"/>
+              <w:jc w:val="left"/>
+            </w:pPr>
+            <w:r>
+              <w:t xml:space="preserve">Scale 1: Original values</w:t>
+            </w:r>
+          </w:p>
+        </w:tc>
+        <w:tc>
+          <w:p>
+            <w:pPr>
+              <w:pStyle w:val="Compact"/>
+              <w:jc w:val="right"/>
+            </w:pPr>
+            <w:r>
+              <w:t xml:space="preserve">NA</w:t>
+            </w:r>
+          </w:p>
+        </w:tc>
+        <w:tc>
+          <w:p>
+            <w:pPr>
+              <w:pStyle w:val="Compact"/>
+              <w:jc w:val="right"/>
+            </w:pPr>
+            <w:r>
+              <w:t xml:space="preserve">NA</w:t>
+            </w:r>
+          </w:p>
+        </w:tc>
+        <w:tc>
+          <w:p>
+            <w:pPr>
+              <w:pStyle w:val="Compact"/>
+              <w:jc w:val="right"/>
+            </w:pPr>
+            <w:r>
+              <w:t xml:space="preserve">NA</w:t>
+            </w:r>
+          </w:p>
+        </w:tc>
+        <w:tc>
+          <w:p>
+            <w:pPr>
+              <w:pStyle w:val="Compact"/>
+              <w:jc w:val="right"/>
+            </w:pPr>
+            <w:r>
+              <w:t xml:space="preserve">NA</w:t>
+            </w:r>
+          </w:p>
+        </w:tc>
+        <w:tc>
+          <w:p>
+            <w:pPr>
+              <w:pStyle w:val="Compact"/>
+              <w:jc w:val="right"/>
+            </w:pPr>
+            <w:r>
+              <w:t xml:space="preserve">NA</w:t>
+            </w:r>
+          </w:p>
+        </w:tc>
+      </w:tr>
+      <w:tr>
+        <w:tc>
+          <w:p>
+            <w:pPr>
+              <w:pStyle w:val="Compact"/>
+              <w:jc w:val="left"/>
+            </w:pPr>
+            <w:r>
+              <w:t xml:space="preserve">Labor productivity</w:t>
+            </w:r>
+          </w:p>
+        </w:tc>
+        <w:tc>
+          <w:p>
+            <w:pPr>
+              <w:pStyle w:val="Compact"/>
+              <w:jc w:val="right"/>
+            </w:pPr>
+            <w:r>
+              <w:t xml:space="preserve">19.09</w:t>
+            </w:r>
+          </w:p>
+        </w:tc>
+        <w:tc>
+          <w:p>
+            <w:pPr>
+              <w:pStyle w:val="Compact"/>
+              <w:jc w:val="right"/>
+            </w:pPr>
+            <w:r>
+              <w:t xml:space="preserve">16.82</w:t>
+            </w:r>
+          </w:p>
+        </w:tc>
+        <w:tc>
+          <w:p>
+            <w:pPr>
+              <w:pStyle w:val="Compact"/>
+              <w:jc w:val="right"/>
+            </w:pPr>
+            <w:r>
+              <w:t xml:space="preserve">5.89</w:t>
+            </w:r>
+          </w:p>
+        </w:tc>
+        <w:tc>
+          <w:p>
+            <w:pPr>
+              <w:pStyle w:val="Compact"/>
+              <w:jc w:val="right"/>
+            </w:pPr>
+            <w:r>
+              <w:t xml:space="preserve">14.35</w:t>
+            </w:r>
+          </w:p>
+        </w:tc>
+        <w:tc>
+          <w:p>
+            <w:pPr>
+              <w:pStyle w:val="Compact"/>
+              <w:jc w:val="right"/>
+            </w:pPr>
+            <w:r>
+              <w:t xml:space="preserve">75.03</w:t>
+            </w:r>
+          </w:p>
+        </w:tc>
+      </w:tr>
+      <w:tr>
+        <w:tc>
+          <w:p>
+            <w:pPr>
+              <w:pStyle w:val="Compact"/>
+              <w:jc w:val="left"/>
+            </w:pPr>
+            <w:r>
+              <w:t xml:space="preserve">Physical capital</w:t>
+            </w:r>
+          </w:p>
+        </w:tc>
+        <w:tc>
+          <w:p>
+            <w:pPr>
+              <w:pStyle w:val="Compact"/>
+              <w:jc w:val="right"/>
+            </w:pPr>
+            <w:r>
+              <w:t xml:space="preserve">42.39</w:t>
+            </w:r>
+          </w:p>
+        </w:tc>
+        <w:tc>
+          <w:p>
+            <w:pPr>
+              <w:pStyle w:val="Compact"/>
+              <w:jc w:val="right"/>
+            </w:pPr>
+            <w:r>
+              <w:t xml:space="preserve">48.67</w:t>
+            </w:r>
+          </w:p>
+        </w:tc>
+        <w:tc>
+          <w:p>
+            <w:pPr>
+              <w:pStyle w:val="Compact"/>
+              <w:jc w:val="right"/>
+            </w:pPr>
+            <w:r>
+              <w:t xml:space="preserve">11.13</w:t>
+            </w:r>
+          </w:p>
+        </w:tc>
+        <w:tc>
+          <w:p>
+            <w:pPr>
+              <w:pStyle w:val="Compact"/>
+              <w:jc w:val="right"/>
+            </w:pPr>
+            <w:r>
+              <w:t xml:space="preserve">27.27</w:t>
+            </w:r>
+          </w:p>
+        </w:tc>
+        <w:tc>
+          <w:p>
+            <w:pPr>
+              <w:pStyle w:val="Compact"/>
+              <w:jc w:val="right"/>
+            </w:pPr>
+            <w:r>
+              <w:t xml:space="preserve">248.79</w:t>
+            </w:r>
+          </w:p>
+        </w:tc>
+      </w:tr>
+      <w:tr>
+        <w:tc>
+          <w:p>
+            <w:pPr>
+              <w:pStyle w:val="Compact"/>
+              <w:jc w:val="left"/>
+            </w:pPr>
+            <w:r>
+              <w:t xml:space="preserve">Human capital</w:t>
+            </w:r>
+          </w:p>
+        </w:tc>
+        <w:tc>
+          <w:p>
+            <w:pPr>
+              <w:pStyle w:val="Compact"/>
+              <w:jc w:val="right"/>
+            </w:pPr>
+            <w:r>
+              <w:t xml:space="preserve">7.91</w:t>
+            </w:r>
+          </w:p>
+        </w:tc>
+        <w:tc>
+          <w:p>
+            <w:pPr>
+              <w:pStyle w:val="Compact"/>
+              <w:jc w:val="right"/>
+            </w:pPr>
+            <w:r>
+              <w:t xml:space="preserve">0.99</w:t>
+            </w:r>
+          </w:p>
+        </w:tc>
+        <w:tc>
+          <w:p>
+            <w:pPr>
+              <w:pStyle w:val="Compact"/>
+              <w:jc w:val="right"/>
+            </w:pPr>
+            <w:r>
+              <w:t xml:space="preserve">5.27</w:t>
+            </w:r>
+          </w:p>
+        </w:tc>
+        <w:tc>
+          <w:p>
+            <w:pPr>
+              <w:pStyle w:val="Compact"/>
+              <w:jc w:val="right"/>
+            </w:pPr>
+            <w:r>
+              <w:t xml:space="preserve">7.95</w:t>
+            </w:r>
+          </w:p>
+        </w:tc>
+        <w:tc>
+          <w:p>
+            <w:pPr>
+              <w:pStyle w:val="Compact"/>
+              <w:jc w:val="right"/>
+            </w:pPr>
+            <w:r>
+              <w:t xml:space="preserve">10.42</w:t>
+            </w:r>
+          </w:p>
+        </w:tc>
+      </w:tr>
+      <w:tr>
+        <w:tc>
+          <w:p>
+            <w:pPr>
+              <w:pStyle w:val="Compact"/>
+              <w:jc w:val="left"/>
+            </w:pPr>
+            <w:r>
+              <w:t xml:space="preserve">Efficiency (parametric)</w:t>
+            </w:r>
+          </w:p>
+        </w:tc>
+        <w:tc>
+          <w:p>
+            <w:pPr>
+              <w:pStyle w:val="Compact"/>
+              <w:jc w:val="right"/>
+            </w:pPr>
+            <w:r>
+              <w:t xml:space="preserve">1.33</w:t>
+            </w:r>
+          </w:p>
+        </w:tc>
+        <w:tc>
+          <w:p>
+            <w:pPr>
+              <w:pStyle w:val="Compact"/>
+              <w:jc w:val="right"/>
+            </w:pPr>
+            <w:r>
+              <w:t xml:space="preserve">0.57</w:t>
+            </w:r>
+          </w:p>
+        </w:tc>
+        <w:tc>
+          <w:p>
+            <w:pPr>
+              <w:pStyle w:val="Compact"/>
+              <w:jc w:val="right"/>
+            </w:pPr>
+            <w:r>
+              <w:t xml:space="preserve">0.73</w:t>
+            </w:r>
+          </w:p>
+        </w:tc>
+        <w:tc>
+          <w:p>
+            <w:pPr>
+              <w:pStyle w:val="Compact"/>
+              <w:jc w:val="right"/>
+            </w:pPr>
+            <w:r>
+              <w:t xml:space="preserve">1.21</w:t>
+            </w:r>
+          </w:p>
+        </w:tc>
+        <w:tc>
+          <w:p>
+            <w:pPr>
+              <w:pStyle w:val="Compact"/>
+              <w:jc w:val="right"/>
+            </w:pPr>
+            <w:r>
+              <w:t xml:space="preserve">3.35</w:t>
+            </w:r>
+          </w:p>
+        </w:tc>
+      </w:tr>
+      <w:tr>
+        <w:tc>
+          <w:p>
+            <w:pPr>
+              <w:pStyle w:val="Compact"/>
+              <w:jc w:val="left"/>
+            </w:pPr>
+            <w:r>
+              <w:t xml:space="preserve">Efficiency (nonparametric)</w:t>
+            </w:r>
+          </w:p>
+        </w:tc>
+        <w:tc>
+          <w:p>
+            <w:pPr>
+              <w:pStyle w:val="Compact"/>
+              <w:jc w:val="right"/>
+            </w:pPr>
+            <w:r>
+              <w:t xml:space="preserve">77.13</w:t>
+            </w:r>
+          </w:p>
+        </w:tc>
+        <w:tc>
+          <w:p>
+            <w:pPr>
+              <w:pStyle w:val="Compact"/>
+              <w:jc w:val="right"/>
+            </w:pPr>
+            <w:r>
+              <w:t xml:space="preserve">17.76</w:t>
+            </w:r>
+          </w:p>
+        </w:tc>
+        <w:tc>
+          <w:p>
+            <w:pPr>
+              <w:pStyle w:val="Compact"/>
+              <w:jc w:val="right"/>
+            </w:pPr>
+            <w:r>
+              <w:t xml:space="preserve">40.70</w:t>
+            </w:r>
+          </w:p>
+        </w:tc>
+        <w:tc>
+          <w:p>
+            <w:pPr>
+              <w:pStyle w:val="Compact"/>
+              <w:jc w:val="right"/>
+            </w:pPr>
+            <w:r>
+              <w:t xml:space="preserve">77.55</w:t>
+            </w:r>
+          </w:p>
+        </w:tc>
+        <w:tc>
+          <w:p>
+            <w:pPr>
+              <w:pStyle w:val="Compact"/>
+              <w:jc w:val="right"/>
+            </w:pPr>
+            <w:r>
+              <w:t xml:space="preserve">100.00</w:t>
+            </w:r>
+          </w:p>
+        </w:tc>
+      </w:tr>
+      <w:tr>
+        <w:tc>
+          <w:p>
+            <w:pPr>
+              <w:pStyle w:val="Compact"/>
+              <w:jc w:val="left"/>
+            </w:pPr>
+            <w:r>
+              <w:t xml:space="preserve">Scale 2: Relative log trends</w:t>
+            </w:r>
+          </w:p>
+        </w:tc>
+        <w:tc>
+          <w:p>
+            <w:pPr>
+              <w:pStyle w:val="Compact"/>
+              <w:jc w:val="right"/>
+            </w:pPr>
+            <w:r>
+              <w:t xml:space="preserve">NA</w:t>
+            </w:r>
+          </w:p>
+        </w:tc>
+        <w:tc>
+          <w:p>
+            <w:pPr>
+              <w:pStyle w:val="Compact"/>
+              <w:jc w:val="right"/>
+            </w:pPr>
+            <w:r>
+              <w:t xml:space="preserve">NA</w:t>
+            </w:r>
+          </w:p>
+        </w:tc>
+        <w:tc>
+          <w:p>
+            <w:pPr>
+              <w:pStyle w:val="Compact"/>
+              <w:jc w:val="right"/>
+            </w:pPr>
+            <w:r>
+              <w:t xml:space="preserve">NA</w:t>
+            </w:r>
+          </w:p>
+        </w:tc>
+        <w:tc>
+          <w:p>
+            <w:pPr>
+              <w:pStyle w:val="Compact"/>
+              <w:jc w:val="right"/>
+            </w:pPr>
+            <w:r>
+              <w:t xml:space="preserve">NA</w:t>
+            </w:r>
+          </w:p>
+        </w:tc>
+        <w:tc>
+          <w:p>
+            <w:pPr>
+              <w:pStyle w:val="Compact"/>
+              <w:jc w:val="right"/>
+            </w:pPr>
+            <w:r>
+              <w:t xml:space="preserve">NA</w:t>
+            </w:r>
+          </w:p>
+        </w:tc>
+      </w:tr>
+      <w:tr>
+        <w:tc>
+          <w:p>
+            <w:pPr>
+              <w:pStyle w:val="Compact"/>
+              <w:jc w:val="left"/>
+            </w:pPr>
+            <w:r>
+              <w:t xml:space="preserve">Labor productivity</w:t>
+            </w:r>
+          </w:p>
+        </w:tc>
+        <w:tc>
+          <w:p>
+            <w:pPr>
+              <w:pStyle w:val="Compact"/>
+              <w:jc w:val="right"/>
+            </w:pPr>
+            <w:r>
+              <w:t xml:space="preserve">1.00</w:t>
+            </w:r>
+          </w:p>
+        </w:tc>
+        <w:tc>
+          <w:p>
+            <w:pPr>
+              <w:pStyle w:val="Compact"/>
+              <w:jc w:val="right"/>
+            </w:pPr>
+            <w:r>
+              <w:t xml:space="preserve">0.22</w:t>
+            </w:r>
+          </w:p>
+        </w:tc>
+        <w:tc>
+          <w:p>
+            <w:pPr>
+              <w:pStyle w:val="Compact"/>
+              <w:jc w:val="right"/>
+            </w:pPr>
+            <w:r>
+              <w:t xml:space="preserve">0.64</w:t>
+            </w:r>
+          </w:p>
+        </w:tc>
+        <w:tc>
+          <w:p>
+            <w:pPr>
+              <w:pStyle w:val="Compact"/>
+              <w:jc w:val="right"/>
+            </w:pPr>
+            <w:r>
+              <w:t xml:space="preserve">0.96</w:t>
+            </w:r>
+          </w:p>
+        </w:tc>
+        <w:tc>
+          <w:p>
+            <w:pPr>
+              <w:pStyle w:val="Compact"/>
+              <w:jc w:val="right"/>
+            </w:pPr>
+            <w:r>
+              <w:t xml:space="preserve">1.59</w:t>
+            </w:r>
+          </w:p>
+        </w:tc>
+      </w:tr>
+      <w:tr>
+        <w:tc>
+          <w:p>
+            <w:pPr>
+              <w:pStyle w:val="Compact"/>
+              <w:jc w:val="left"/>
+            </w:pPr>
+            <w:r>
+              <w:t xml:space="preserve">Physical capital</w:t>
+            </w:r>
+          </w:p>
+        </w:tc>
+        <w:tc>
+          <w:p>
+            <w:pPr>
+              <w:pStyle w:val="Compact"/>
+              <w:jc w:val="right"/>
+            </w:pPr>
+            <w:r>
+              <w:t xml:space="preserve">1.00</w:t>
+            </w:r>
+          </w:p>
+        </w:tc>
+        <w:tc>
+          <w:p>
+            <w:pPr>
+              <w:pStyle w:val="Compact"/>
+              <w:jc w:val="right"/>
+            </w:pPr>
+            <w:r>
+              <w:t xml:space="preserve">0.21</w:t>
+            </w:r>
+          </w:p>
+        </w:tc>
+        <w:tc>
+          <w:p>
+            <w:pPr>
+              <w:pStyle w:val="Compact"/>
+              <w:jc w:val="right"/>
+            </w:pPr>
+            <w:r>
+              <w:t xml:space="preserve">0.70</w:t>
+            </w:r>
+          </w:p>
+        </w:tc>
+        <w:tc>
+          <w:p>
+            <w:pPr>
+              <w:pStyle w:val="Compact"/>
+              <w:jc w:val="right"/>
+            </w:pPr>
+            <w:r>
+              <w:t xml:space="preserve">0.96</w:t>
+            </w:r>
+          </w:p>
+        </w:tc>
+        <w:tc>
+          <w:p>
+            <w:pPr>
+              <w:pStyle w:val="Compact"/>
+              <w:jc w:val="right"/>
+            </w:pPr>
+            <w:r>
+              <w:t xml:space="preserve">1.61</w:t>
+            </w:r>
+          </w:p>
+        </w:tc>
+      </w:tr>
+      <w:tr>
+        <w:tc>
+          <w:p>
+            <w:pPr>
+              <w:pStyle w:val="Compact"/>
+              <w:jc w:val="left"/>
+            </w:pPr>
+            <w:r>
+              <w:t xml:space="preserve">Human capital</w:t>
+            </w:r>
+          </w:p>
+        </w:tc>
+        <w:tc>
+          <w:p>
+            <w:pPr>
+              <w:pStyle w:val="Compact"/>
+              <w:jc w:val="right"/>
+            </w:pPr>
+            <w:r>
+              <w:t xml:space="preserve">1.00</w:t>
+            </w:r>
+          </w:p>
+        </w:tc>
+        <w:tc>
+          <w:p>
+            <w:pPr>
+              <w:pStyle w:val="Compact"/>
+              <w:jc w:val="right"/>
+            </w:pPr>
+            <w:r>
+              <w:t xml:space="preserve">0.06</w:t>
+            </w:r>
+          </w:p>
+        </w:tc>
+        <w:tc>
+          <w:p>
+            <w:pPr>
+              <w:pStyle w:val="Compact"/>
+              <w:jc w:val="right"/>
+            </w:pPr>
+            <w:r>
+              <w:t xml:space="preserve">0.82</w:t>
+            </w:r>
+          </w:p>
+        </w:tc>
+        <w:tc>
+          <w:p>
+            <w:pPr>
+              <w:pStyle w:val="Compact"/>
+              <w:jc w:val="right"/>
+            </w:pPr>
+            <w:r>
+              <w:t xml:space="preserve">1.01</w:t>
+            </w:r>
+          </w:p>
+        </w:tc>
+        <w:tc>
+          <w:p>
+            <w:pPr>
+              <w:pStyle w:val="Compact"/>
+              <w:jc w:val="right"/>
+            </w:pPr>
+            <w:r>
+              <w:t xml:space="preserve">1.14</w:t>
+            </w:r>
+          </w:p>
+        </w:tc>
+      </w:tr>
+      <w:tr>
+        <w:tc>
+          <w:p>
+            <w:pPr>
+              <w:pStyle w:val="Compact"/>
+              <w:jc w:val="left"/>
+            </w:pPr>
+            <w:r>
+              <w:t xml:space="preserve">Efficiency (parametric)</w:t>
+            </w:r>
+          </w:p>
+        </w:tc>
+        <w:tc>
+          <w:p>
+            <w:pPr>
+              <w:pStyle w:val="Compact"/>
+              <w:jc w:val="right"/>
+            </w:pPr>
+            <w:r>
+              <w:t xml:space="preserve">1.00</w:t>
+            </w:r>
+          </w:p>
+        </w:tc>
+        <w:tc>
+          <w:p>
+            <w:pPr>
+              <w:pStyle w:val="Compact"/>
+              <w:jc w:val="right"/>
+            </w:pPr>
+            <w:r>
+              <w:t xml:space="preserve">1.52</w:t>
+            </w:r>
+          </w:p>
+        </w:tc>
+        <w:tc>
+          <w:p>
+            <w:pPr>
+              <w:pStyle w:val="Compact"/>
+              <w:jc w:val="right"/>
+            </w:pPr>
+            <w:r>
+              <w:t xml:space="preserve">-1.33</w:t>
+            </w:r>
+          </w:p>
+        </w:tc>
+        <w:tc>
+          <w:p>
+            <w:pPr>
+              <w:pStyle w:val="Compact"/>
+              <w:jc w:val="right"/>
+            </w:pPr>
+            <w:r>
+              <w:t xml:space="preserve">0.82</w:t>
+            </w:r>
+          </w:p>
+        </w:tc>
+        <w:tc>
+          <w:p>
+            <w:pPr>
+              <w:pStyle w:val="Compact"/>
+              <w:jc w:val="right"/>
+            </w:pPr>
+            <w:r>
+              <w:t xml:space="preserve">5.38</w:t>
+            </w:r>
+          </w:p>
+        </w:tc>
+      </w:tr>
+      <w:tr>
+        <w:tc>
+          <w:p>
+            <w:pPr>
+              <w:pStyle w:val="Compact"/>
+              <w:jc w:val="left"/>
+            </w:pPr>
+            <w:r>
+              <w:t xml:space="preserve">Efficiency (nonparametric)</w:t>
+            </w:r>
+          </w:p>
+        </w:tc>
+        <w:tc>
+          <w:p>
+            <w:pPr>
+              <w:pStyle w:val="Compact"/>
+              <w:jc w:val="right"/>
+            </w:pPr>
+            <w:r>
+              <w:t xml:space="preserve">1.00</w:t>
+            </w:r>
+          </w:p>
+        </w:tc>
+        <w:tc>
+          <w:p>
+            <w:pPr>
+              <w:pStyle w:val="Compact"/>
+              <w:jc w:val="right"/>
+            </w:pPr>
+            <w:r>
+              <w:t xml:space="preserve">0.06</w:t>
+            </w:r>
+          </w:p>
+        </w:tc>
+        <w:tc>
+          <w:p>
+            <w:pPr>
+              <w:pStyle w:val="Compact"/>
+              <w:jc w:val="right"/>
+            </w:pPr>
+            <w:r>
+              <w:t xml:space="preserve">0.86</w:t>
+            </w:r>
+          </w:p>
+        </w:tc>
+        <w:tc>
+          <w:p>
+            <w:pPr>
+              <w:pStyle w:val="Compact"/>
+              <w:jc w:val="right"/>
+            </w:pPr>
+            <w:r>
+              <w:t xml:space="preserve">1.01</w:t>
+            </w:r>
+          </w:p>
+        </w:tc>
+        <w:tc>
+          <w:p>
+            <w:pPr>
+              <w:pStyle w:val="Compact"/>
+              <w:jc w:val="right"/>
+            </w:pPr>
+            <w:r>
+              <w:t xml:space="preserve">1.07</w:t>
+            </w:r>
+          </w:p>
+        </w:tc>
+      </w:tr>
+    </w:tbl>
     <w:p>
       <w:pPr>
         <w:pStyle w:val="BodyText"/>

</xml_diff>

<commit_message>
add code forlder for stargazer tables
</commit_message>
<xml_diff>
--- a/manuscript-workingPaper/manuscript-workingPaper.docx
+++ b/manuscript-workingPaper/manuscript-workingPaper.docx
@@ -281,7 +281,7 @@
       <w:pPr>
         <w:pStyle w:val="Heading2"/>
       </w:pPr>
-      <w:bookmarkStart w:id="24" w:name="two-established-literatures-productivity-accounting-and-convergence"/>
+      <w:bookmarkStart w:id="24" w:name="X709db10dbca1316c357a701f863398db1c56542"/>
       <w:r>
         <w:t xml:space="preserve">Two established literatures: Productivity accounting and convergence</w:t>
       </w:r>
@@ -328,7 +328,7 @@
       <w:pPr>
         <w:pStyle w:val="Heading2"/>
       </w:pPr>
-      <w:bookmarkStart w:id="27" w:name="data-construction-and-descriptive-statistics"/>
+      <w:bookmarkStart w:id="27" w:name="X10d902f12a882dfee2fa6c910876dd4bf80e45a"/>
       <w:r>
         <w:t xml:space="preserve">Data construction and descriptive statistics</w:t>
       </w:r>
@@ -2609,7 +2609,7 @@
       <w:pPr>
         <w:pStyle w:val="Heading2"/>
       </w:pPr>
-      <w:bookmarkStart w:id="37" w:name="a-convergence-clubs-using-a-common-y-axis"/>
+      <w:bookmarkStart w:id="37" w:name="X8cd98c507853c5f64452146b272171b9e75081f"/>
       <w:r>
         <w:t xml:space="preserve">A) Convergence clubs using a common Y axis</w:t>
       </w:r>
@@ -2644,7 +2644,7 @@
       <w:pPr>
         <w:pStyle w:val="Heading2"/>
       </w:pPr>
-      <w:bookmarkStart w:id="40" w:name="b-initial-before-merge-convergence-clubs-of-physical-capital-per-worker"/>
+      <w:bookmarkStart w:id="40" w:name="Xf6e8b7ab56f4b9c1511e604ac6a029935547010"/>
       <w:r>
         <w:t xml:space="preserve">B) Initial (before merge) convergence clubs of physical capital per worker</w:t>
       </w:r>
@@ -2687,7 +2687,7 @@
         <w:t xml:space="preserve"> </w:t>
       </w:r>
       <w:r>
-        <w:t xml:space="preserve">2 (2). Wiley Online Library: 165–91.</w:t>
+        <w:t xml:space="preserve">2 (2): 165–91.</w:t>
       </w:r>
     </w:p>
     <w:bookmarkEnd w:id="42"/>
@@ -2712,7 +2712,7 @@
         <w:t xml:space="preserve"> </w:t>
       </w:r>
       <w:r>
-        <w:t xml:space="preserve">25 (1). Wiley Online Library: 55–77.</w:t>
+        <w:t xml:space="preserve">25 (1): 55–77.</w:t>
       </w:r>
     </w:p>
     <w:bookmarkEnd w:id="43"/>
@@ -2737,7 +2737,7 @@
         <w:t xml:space="preserve"> </w:t>
       </w:r>
       <w:r>
-        <w:t xml:space="preserve">31 (2). Taylor &amp; Francis: 61–81.</w:t>
+        <w:t xml:space="preserve">31 (2): 61–81.</w:t>
       </w:r>
     </w:p>
     <w:bookmarkEnd w:id="44"/>
@@ -2747,7 +2747,7 @@
         <w:pStyle w:val="Bibliography"/>
       </w:pPr>
       <w:r>
-        <w:t xml:space="preserve">Bendesa, I Komang Gde, Luh Gede Meydianawathi, Hefrizal Handra, D.S. Priyarsono Djoni Hartono, Budy P. Resosudarmo, and Arief A. Yusuf. 2016.</w:t>
+        <w:t xml:space="preserve">Bendesa, I Komang Gde, Luh Gede Meydianawathi, Hefrizal Handra, D. S. Priyarsono Djoni Hartono, Budy P. Resosudarmo, and Arief A. Yusuf. 2016.</w:t>
       </w:r>
       <w:r>
         <w:t xml:space="preserve"> </w:t>
@@ -2784,7 +2784,7 @@
         <w:t xml:space="preserve"> </w:t>
       </w:r>
       <w:r>
-        <w:t xml:space="preserve">11 (1). Taylor &amp; Francis: 41–57.</w:t>
+        <w:t xml:space="preserve">11 (1): 41–57.</w:t>
       </w:r>
     </w:p>
     <w:bookmarkEnd w:id="46"/>
@@ -2809,7 +2809,7 @@
         <w:t xml:space="preserve"> </w:t>
       </w:r>
       <w:r>
-        <w:t xml:space="preserve">34 (1). Taylor &amp; Francis: 95–120.</w:t>
+        <w:t xml:space="preserve">34 (1): 95–120.</w:t>
       </w:r>
     </w:p>
     <w:bookmarkEnd w:id="47"/>
@@ -2858,7 +2858,7 @@
         <w:t xml:space="preserve"> </w:t>
       </w:r>
       <w:r>
-        <w:t xml:space="preserve">40 (4). JAPAN SECTION OF THE REGIONAL SCIENCE ASSOCIATION INTERNATIONAL: 1061–72.</w:t>
+        <w:t xml:space="preserve">40 (4): 1061–72.</w:t>
       </w:r>
     </w:p>
     <w:bookmarkEnd w:id="50"/>
@@ -2883,7 +2883,7 @@
         <w:t xml:space="preserve"> </w:t>
       </w:r>
       <w:r>
-        <w:t xml:space="preserve">27 (4). Wiley Online Library: 409–28.</w:t>
+        <w:t xml:space="preserve">27 (4): 409–28.</w:t>
       </w:r>
     </w:p>
     <w:bookmarkEnd w:id="51"/>
@@ -2908,7 +2908,7 @@
         <w:t xml:space="preserve"> </w:t>
       </w:r>
       <w:r>
-        <w:t xml:space="preserve">2 (2). Springer: 297–313.</w:t>
+        <w:t xml:space="preserve">2 (2): 297–313.</w:t>
       </w:r>
     </w:p>
     <w:bookmarkEnd w:id="52"/>
@@ -2933,22 +2933,47 @@
         <w:t xml:space="preserve"> </w:t>
       </w:r>
       <w:r>
-        <w:t xml:space="preserve">11 (1). Wiley Online Library: 89–108.</w:t>
+        <w:t xml:space="preserve">11 (1): 89–108.</w:t>
       </w:r>
     </w:p>
     <w:bookmarkEnd w:id="53"/>
-    <w:bookmarkStart w:id="55" w:name="ref-mendez2019efficiencyIndonesia"/>
+    <w:bookmarkStart w:id="54" w:name="ref-mendez2020efficiencyConvergence"/>
     <w:p>
       <w:pPr>
         <w:pStyle w:val="Bibliography"/>
       </w:pPr>
       <w:r>
-        <w:t xml:space="preserve">Mendez, Carlos. 2019. “Regional Efficiency Dispersion, Convergence, and Efficiency Clusters: Evidence from the Provinces of Indonesia 1990-2010.” MPRA Working Paper 97090. University Library of Munich, Germany.</w:t>
-      </w:r>
-      <w:r>
-        <w:t xml:space="preserve"> </w:t>
-      </w:r>
-      <w:hyperlink r:id="rId54">
+        <w:t xml:space="preserve">Mendez, Carlos. 2020. “Regional Efficiency Convergence and Efficiency Clusters: Evidence from the Provinces of Indonesia 1990–2010.”</w:t>
+      </w:r>
+      <w:r>
+        <w:t xml:space="preserve"> </w:t>
+      </w:r>
+      <w:r>
+        <w:rPr>
+          <w:i/>
+        </w:rPr>
+        <w:t xml:space="preserve">Asia-Pacific Journal of Regional Science</w:t>
+      </w:r>
+      <w:r>
+        <w:t xml:space="preserve"> </w:t>
+      </w:r>
+      <w:r>
+        <w:t xml:space="preserve">https://doi.org/10.1007/s41685-020-00144-w.</w:t>
+      </w:r>
+    </w:p>
+    <w:bookmarkEnd w:id="54"/>
+    <w:bookmarkStart w:id="56" w:name="ref-mendez2019efficiencyIndonesia"/>
+    <w:p>
+      <w:pPr>
+        <w:pStyle w:val="Bibliography"/>
+      </w:pPr>
+      <w:r>
+        <w:t xml:space="preserve">———. 2019. “Regional Efficiency Dispersion, Convergence, and Efficiency Clusters: Evidence from the Provinces of Indonesia 1990-2010.” MPRA Working Paper 97090. University Library of Munich, Germany.</w:t>
+      </w:r>
+      <w:r>
+        <w:t xml:space="preserve"> </w:t>
+      </w:r>
+      <w:hyperlink r:id="rId55">
         <w:r>
           <w:rPr>
             <w:rStyle w:val="Hyperlink"/>
@@ -2960,31 +2985,6 @@
         <w:t xml:space="preserve">.</w:t>
       </w:r>
     </w:p>
-    <w:bookmarkEnd w:id="55"/>
-    <w:bookmarkStart w:id="56" w:name="ref-mendez2020efficiencyConvergence"/>
-    <w:p>
-      <w:pPr>
-        <w:pStyle w:val="Bibliography"/>
-      </w:pPr>
-      <w:r>
-        <w:t xml:space="preserve">———. 2020. “Regional Efficiency Convergence and Efficiency Clusters: Evidence from the Provinces of Indonesia 1990–2010.”</w:t>
-      </w:r>
-      <w:r>
-        <w:t xml:space="preserve"> </w:t>
-      </w:r>
-      <w:r>
-        <w:rPr>
-          <w:i/>
-        </w:rPr>
-        <w:t xml:space="preserve">Asia-Pacific Journal of Regional Science</w:t>
-      </w:r>
-      <w:r>
-        <w:t xml:space="preserve"> </w:t>
-      </w:r>
-      <w:r>
-        <w:t xml:space="preserve">https://doi.org/10.1007/s41685-020-00144-w. Springer.</w:t>
-      </w:r>
-    </w:p>
     <w:bookmarkEnd w:id="56"/>
     <w:bookmarkStart w:id="57" w:name="ref-mishra2009economic"/>
     <w:p>
@@ -3029,7 +3029,7 @@
         <w:t xml:space="preserve"> </w:t>
       </w:r>
       <w:r>
-        <w:t xml:space="preserve">75 (6). Wiley Online Library: 1771–1855.</w:t>
+        <w:t xml:space="preserve">75 (6): 1771–1855.</w:t>
       </w:r>
     </w:p>
     <w:bookmarkEnd w:id="58"/>
@@ -3054,7 +3054,7 @@
         <w:t xml:space="preserve"> </w:t>
       </w:r>
       <w:r>
-        <w:t xml:space="preserve">24 (7). Wiley Online Library: 1153–85.</w:t>
+        <w:t xml:space="preserve">24 (7): 1153–85.</w:t>
       </w:r>
     </w:p>
     <w:bookmarkEnd w:id="59"/>
@@ -3076,7 +3076,7 @@
         <w:t xml:space="preserve">ASEAN Economic Bulletin</w:t>
       </w:r>
       <w:r>
-        <w:t xml:space="preserve">. JSTOR, 31–44.</w:t>
+        <w:t xml:space="preserve">, 31–44.</w:t>
       </w:r>
     </w:p>
     <w:bookmarkEnd w:id="60"/>
@@ -3126,7 +3126,7 @@
         <w:t xml:space="preserve"> </w:t>
       </w:r>
       <w:r>
-        <w:t xml:space="preserve">70 (1). MIT Press: 65–94.</w:t>
+        <w:t xml:space="preserve">70 (1): 65–94.</w:t>
       </w:r>
     </w:p>
     <w:bookmarkEnd w:id="62"/>
@@ -3151,7 +3151,7 @@
         <w:t xml:space="preserve"> </w:t>
       </w:r>
       <w:r>
-        <w:t xml:space="preserve">49 (2). Taylor &amp; Francis: 193–211.</w:t>
+        <w:t xml:space="preserve">49 (2): 193–211.</w:t>
       </w:r>
     </w:p>
     <w:bookmarkEnd w:id="63"/>
@@ -3279,109 +3279,6 @@
 <file path=word/numbering.xml><?xml version="1.0" encoding="utf-8"?>
 <w:numbering xmlns:w="http://schemas.openxmlformats.org/wordprocessingml/2006/main">
   <w:abstractNum w:abstractNumId="990">
-    <w:nsid w:val="170cd2de"/>
-    <w:multiLevelType w:val="multilevel"/>
-    <w:lvl w:ilvl="0">
-      <w:numFmt w:val="bullet"/>
-      <w:lvlText w:val=" "/>
-      <w:lvlJc w:val="left"/>
-      <w:pPr>
-        <w:tabs>
-          <w:tab w:val="num" w:pos="0"/>
-        </w:tabs>
-        <w:ind w:left="480" w:hanging="480"/>
-      </w:pPr>
-    </w:lvl>
-    <w:lvl w:ilvl="1">
-      <w:numFmt w:val="bullet"/>
-      <w:lvlText w:val=" "/>
-      <w:lvlJc w:val="left"/>
-      <w:pPr>
-        <w:tabs>
-          <w:tab w:val="num" w:pos="720"/>
-        </w:tabs>
-        <w:ind w:left="1200" w:hanging="480"/>
-      </w:pPr>
-    </w:lvl>
-    <w:lvl w:ilvl="2">
-      <w:numFmt w:val="bullet"/>
-      <w:lvlText w:val=" "/>
-      <w:lvlJc w:val="left"/>
-      <w:pPr>
-        <w:tabs>
-          <w:tab w:val="num" w:pos="1440"/>
-        </w:tabs>
-        <w:ind w:left="1920" w:hanging="480"/>
-      </w:pPr>
-    </w:lvl>
-    <w:lvl w:ilvl="3">
-      <w:numFmt w:val="bullet"/>
-      <w:lvlText w:val=" "/>
-      <w:lvlJc w:val="left"/>
-      <w:pPr>
-        <w:tabs>
-          <w:tab w:val="num" w:pos="2160"/>
-        </w:tabs>
-        <w:ind w:left="2640" w:hanging="480"/>
-      </w:pPr>
-    </w:lvl>
-    <w:lvl w:ilvl="4">
-      <w:numFmt w:val="bullet"/>
-      <w:lvlText w:val=" "/>
-      <w:lvlJc w:val="left"/>
-      <w:pPr>
-        <w:tabs>
-          <w:tab w:val="num" w:pos="2880"/>
-        </w:tabs>
-        <w:ind w:left="3360" w:hanging="480"/>
-      </w:pPr>
-    </w:lvl>
-    <w:lvl w:ilvl="5">
-      <w:numFmt w:val="bullet"/>
-      <w:lvlText w:val=" "/>
-      <w:lvlJc w:val="left"/>
-      <w:pPr>
-        <w:tabs>
-          <w:tab w:val="num" w:pos="3600"/>
-        </w:tabs>
-        <w:ind w:left="4080" w:hanging="480"/>
-      </w:pPr>
-    </w:lvl>
-    <w:lvl w:ilvl="6">
-      <w:numFmt w:val="bullet"/>
-      <w:lvlText w:val=" "/>
-      <w:lvlJc w:val="left"/>
-      <w:pPr>
-        <w:tabs>
-          <w:tab w:val="num" w:pos="4320"/>
-        </w:tabs>
-        <w:ind w:left="4800" w:hanging="480"/>
-      </w:pPr>
-    </w:lvl>
-    <w:lvl w:ilvl="7">
-      <w:numFmt w:val="bullet"/>
-      <w:lvlText w:val=" "/>
-      <w:lvlJc w:val="left"/>
-      <w:pPr>
-        <w:tabs>
-          <w:tab w:val="num" w:pos="5040"/>
-        </w:tabs>
-        <w:ind w:left="5520" w:hanging="480"/>
-      </w:pPr>
-    </w:lvl>
-    <w:lvl w:ilvl="8">
-      <w:numFmt w:val="bullet"/>
-      <w:lvlText w:val=" "/>
-      <w:lvlJc w:val="left"/>
-      <w:pPr>
-        <w:tabs>
-          <w:tab w:val="num" w:pos="5760"/>
-        </w:tabs>
-        <w:ind w:left="6240" w:hanging="480"/>
-      </w:pPr>
-    </w:lvl>
-  </w:abstractNum>
-  <w:abstractNum w:abstractNumId="990">
     <w:nsid w:val="2c1ae401"/>
     <w:multiLevelType w:val="multilevel"/>
     <w:lvl w:ilvl="0">
@@ -3484,9 +3381,6 @@
       </w:pPr>
     </w:lvl>
   </w:abstractNum>
-  <w:num w:numId="1000">
-    <w:abstractNumId w:val="990"/>
-  </w:num>
   <w:num w:numId="1000">
     <w:abstractNumId w:val="990"/>
   </w:num>

</xml_diff>